<commit_message>
Date Siemens as ongoing part-time rather than a closed summer term
The internship term ended but the work continues part-time during term,
so a closed "Summer 2026" range was not accurate and would have
contradicted LinkedIn, which shows the role as current.

Now reads "Summer 2026 - Present" with "part-time during term" in the
meta line, on all four resume surfaces. Availability for Summer 2027 is
stated outright in the hero and the recruiter banner rather than implied
by a date range, which is the more reliable signal anyway.

Still one page.
</commit_message>
<xml_diff>
--- a/James_Liebel_Resume.docx
+++ b/James_Liebel_Resume.docx
@@ -250,32 +250,24 @@
           <w:sz w:val="19"/>
           <w:szCs w:val="19"/>
         </w:rPr>
-        <w:t xml:space="preserve">Software Development Intern, Strategic Student Program (SSP) – Siemens, Digital Industries</w:t>
-      </w:r>
+        <w:t>Software Development Intern, Strategic Student Program (SSP) – Siemens, Digital Industries</w:t>
+        <w:tab/>
+        <w:t>Summer 2026 – Present</w:t>
+      </w:r>
+    </w:p>
+    <w:p>
+      <w:pPr>
+        <w:spacing w:after="40"/>
+      </w:pPr>
       <w:r>
         <w:rPr>
           <w:i/>
           <w:iCs/>
           <w:color w:val="555555"/>
-          <w:sz w:val="18"/>
-          <w:szCs w:val="18"/>
-        </w:rPr>
-        <w:t xml:space="preserve">	Summer 2026</w:t>
-      </w:r>
-    </w:p>
-    <w:p>
-      <w:pPr>
-        <w:spacing w:after="40"/>
-      </w:pPr>
-      <w:r>
-        <w:rPr>
-          <w:i/>
-          <w:iCs/>
-          <w:color w:val="555555"/>
           <w:sz w:val="17"/>
           <w:szCs w:val="17"/>
         </w:rPr>
-        <w:t>Sole engineer · Next.js · TypeScript · PostgreSQL · Cincinnati, OH</w:t>
+        <w:t>Sole engineer · Next.js · TypeScript · PostgreSQL · part-time during term · Cincinnati, OH</w:t>
       </w:r>
     </w:p>
     <w:p>

</xml_diff>

<commit_message>
Cite the real CustomStrat traffic and conversions from Clarity
The Search Console numbers were organic search only, which is why they
looked thin. Clarity covers every channel and gives figures worth
standing behind: 485 unique users across 733 sessions with bot traffic
excluded, 72% of them first-time, producing 18 service-level clicks and
15 contact conversions.

The conversions are the point. They come from the semantic event layer
rather than a plugin default, so the funnel is measured rather than
guessed, and that is what the copy now leads on.

The project card also carries the real-user timings that are genuinely
good, 2.0s LCP and 0.005 CLS, alongside a 0.41% JavaScript error rate
and no recorded rage clicks. INP is deliberately not claimed: it
measures 790ms, which is poor, and is a real thing to fix rather than
something to present.

Resume still one page.
</commit_message>
<xml_diff>
--- a/James_Liebel_Resume.docx
+++ b/James_Liebel_Resume.docx
@@ -394,24 +394,24 @@
           <w:sz w:val="18"/>
           <w:szCs w:val="18"/>
         </w:rPr>
-        <w:t>Designed and shipped a 29-page statically exported Next.js 16 / React 19 / TypeScript site whose typed content layer derives 13 long-form articles, navigation, and related-article logic from a single source.</w:t>
-      </w:r>
-    </w:p>
-    <w:p>
-      <w:pPr>
-        <w:pStyle w:val="ListParagraph"/>
-        <w:numPr>
-          <w:ilvl w:val="0"/>
-          <w:numId w:val="1"/>
-        </w:numPr>
-        <w:spacing w:after="40"/>
-      </w:pPr>
-      <w:r>
-        <w:rPr>
-          <w:sz w:val="18"/>
-          <w:szCs w:val="18"/>
-        </w:rPr>
-        <w:t>Owned technical SEO and delivery: programmatic sitemap and robots, canonical URLs, a strict meta-delivered CSP, and a custom Node build pipeline; recovered 10 legacy URLs left 404ing by a platform migration.</w:t>
+        <w:t>Designed and shipped a 29-page statically exported Next.js 16 / React 19 / TypeScript site, live to 485 users across 733 sessions, whose typed content layer derives 13 long-form articles and navigation from a single source.</w:t>
+      </w:r>
+    </w:p>
+    <w:p>
+      <w:pPr>
+        <w:pStyle w:val="ListParagraph"/>
+        <w:numPr>
+          <w:ilvl w:val="0"/>
+          <w:numId w:val="1"/>
+        </w:numPr>
+        <w:spacing w:after="40"/>
+      </w:pPr>
+      <w:r>
+        <w:rPr>
+          <w:sz w:val="18"/>
+          <w:szCs w:val="18"/>
+        </w:rPr>
+        <w:t>Owned SEO, delivery and analytics: programmatic sitemap and robots, a strict meta-delivered CSP, a custom Node build pipeline, and a semantic event layer attributing 18 service clicks and 15 contact conversions.</w:t>
       </w:r>
     </w:p>
     <w:p>

</xml_diff>